<commit_message>
Manual: primera ejecucion en Windows puede tardar ~10 min
</commit_message>
<xml_diff>
--- a/Manual_de_Usuario_Moodle_Portable.docx
+++ b/Manual_de_Usuario_Moodle_Portable.docx
@@ -274,7 +274,7 @@
         <w:ind w:left="454" w:hanging="454"/>
       </w:pPr>
       <w:r>
-        <w:t>3. Espera 1 o 2 minutos la primera vez: el programa se prepara solo y aparece un mensaje con la dirección web y la contraseña de administrador.</w:t>
+        <w:t>3. Espera la primera vez: en Windows puede tardar unos 10 minutos (se prepara solo) y aparece un mensaje con la dirección web y la contraseña de administrador.</w:t>
       </w:r>
     </w:p>
     <w:p>
@@ -1035,7 +1035,7 @@
           </w:tcPr>
           <w:p>
             <w:r>
-              <w:t>Es normal: 1 o 2 minutos. Espera al mensaje final.</w:t>
+              <w:t>Es normal: 1–2 minutos en Linux y hasta unos 10 minutos en Windows. Espera al mensaje final.</w:t>
             </w:r>
           </w:p>
         </w:tc>

</xml_diff>